<commit_message>
Document scan baselines and topology semantics
</commit_message>
<xml_diff>
--- a/docs/credit_soc_comprehensive_parameter_scan_report_20260608_v1.docx
+++ b/docs/credit_soc_comprehensive_parameter_scan_report_20260608_v1.docx
@@ -2,10 +2,11 @@
 <file path=word/document.xml><?xml version="1.0" encoding="utf-8"?>
 <w:document xmlns:w="http://schemas.openxmlformats.org/wordprocessingml/2006/main" xmlns:m="http://schemas.openxmlformats.org/officeDocument/2006/math" xmlns:r="http://schemas.openxmlformats.org/officeDocument/2006/relationships" xmlns:o="urn:schemas-microsoft-com:office:office" xmlns:v="urn:schemas-microsoft-com:vml" xmlns:w10="urn:schemas-microsoft-com:office:word" xmlns:a="http://schemas.openxmlformats.org/drawingml/2006/main" xmlns:pic="http://schemas.openxmlformats.org/drawingml/2006/picture" xmlns:wp="http://schemas.openxmlformats.org/drawingml/2006/wordprocessingDrawing">
   <w:body>
-    <w:bookmarkStart w:id="82" w:name="信贷网络完备场景扫描与-soc-相图报告-v1"/>
+    <w:bookmarkStart w:id="83" w:name="信贷网络完备场景扫描与-soc-相图报告-v1"/>
     <w:p>
       <w:pPr>
         <w:pStyle w:val="Heading1"/>
+        <w:ind w:left="0" w:right="0" w:firstLine="0"/>
       </w:pPr>
       <w:r>
         <w:t xml:space="preserve">信贷网络完备场景扫描与 SOC 相图报告 v1</w:t>
@@ -19,10 +20,11 @@
         <w:t xml:space="preserve">生成时间：2026-06-08 23:21:32 CST</w:t>
       </w:r>
     </w:p>
-    <w:bookmarkStart w:id="22" w:name="扫描范围"/>
+    <w:bookmarkStart w:id="23" w:name="扫描范围"/>
     <w:p>
       <w:pPr>
         <w:pStyle w:val="Heading2"/>
+        <w:ind w:left="0" w:right="0" w:firstLine="0"/>
       </w:pPr>
       <w:r>
         <w:t xml:space="preserve">1. 扫描范围</w:t>
@@ -132,10 +134,1093 @@
         <w:t xml:space="preserve">。这是全因子筛选，用于形成相图和挑选 SOC 候选；严格 SOC 推断仍需有限尺寸和平稳性复核。</w:t>
       </w:r>
     </w:p>
-    <w:bookmarkStart w:id="20" w:name="执行摘要"/>
+    <w:bookmarkStart w:id="20" w:name="扫描轴与固定参数基线"/>
     <w:p>
       <w:pPr>
         <w:pStyle w:val="Heading3"/>
+        <w:ind w:left="0" w:right="0" w:firstLine="0"/>
+      </w:pPr>
+      <w:r>
+        <w:t xml:space="preserve">扫描轴与固定参数基线</w:t>
+      </w:r>
+    </w:p>
+    <w:p>
+      <w:pPr>
+        <w:pStyle w:val="FirstParagraph"/>
+      </w:pPr>
+      <w:r>
+        <w:t xml:space="preserve">为避免只看到“扫描参数变化”而忽略共同基线，本轮 8000 个 scenario 的共同实验框架如下。</w:t>
+      </w:r>
+    </w:p>
+    <w:p>
+      <w:pPr>
+        <w:pStyle w:val="BodyText"/>
+      </w:pPr>
+      <w:r>
+        <w:t xml:space="preserve">扫描轴为：</w:t>
+      </w:r>
+    </w:p>
+    <w:tbl>
+      <w:tblPr>
+        <w:tblStyle w:val="Table"/>
+        <w:tblW w:type="pct" w:w="5000"/>
+        <w:tblLook w:firstRow="1" w:lastRow="0" w:firstColumn="0" w:lastColumn="0" w:noHBand="0" w:noVBand="0" w:val="0020"/>
+        <w:jc w:val="start"/>
+        <w:tblLayout w:type="fixed"/>
+      </w:tblPr>
+      <w:tblGrid>
+        <w:gridCol w:w="3960"/>
+        <w:gridCol w:w="3960"/>
+      </w:tblGrid>
+      <w:tr>
+        <w:trPr>
+          <w:tblHeader w:val="true"/>
+        </w:trPr>
+        <w:tc>
+          <w:tcPr/>
+          <w:p>
+            <w:pPr>
+              <w:pStyle w:val="Compact"/>
+              <w:jc w:val="left"/>
+            </w:pPr>
+            <w:r>
+              <w:t xml:space="preserve">轴</w:t>
+            </w:r>
+          </w:p>
+        </w:tc>
+        <w:tc>
+          <w:tcPr/>
+          <w:p>
+            <w:pPr>
+              <w:pStyle w:val="Compact"/>
+              <w:jc w:val="left"/>
+            </w:pPr>
+            <w:r>
+              <w:t xml:space="preserve">取值</w:t>
+            </w:r>
+          </w:p>
+        </w:tc>
+      </w:tr>
+      <w:tr>
+        <w:tc>
+          <w:tcPr/>
+          <w:p>
+            <w:pPr>
+              <w:pStyle w:val="Compact"/>
+              <w:jc w:val="left"/>
+            </w:pPr>
+            <w:r>
+              <w:t xml:space="preserve">收入到信贷尝试转换系数</w:t>
+            </w:r>
+            <w:r>
+              <w:t xml:space="preserve"> </w:t>
+            </w:r>
+            <w:r>
+              <w:rPr>
+                <w:rStyle w:val="VerbatimChar"/>
+              </w:rPr>
+              <w:t xml:space="preserve">c</w:t>
+            </w:r>
+          </w:p>
+        </w:tc>
+        <w:tc>
+          <w:tcPr/>
+          <w:p>
+            <w:pPr>
+              <w:pStyle w:val="Compact"/>
+              <w:jc w:val="left"/>
+            </w:pPr>
+            <w:r>
+              <w:rPr>
+                <w:rStyle w:val="VerbatimChar"/>
+              </w:rPr>
+              <w:t xml:space="preserve">0.10, 0.20, 0.30, 0.40, 0.50, 0.60, 0.70, 0.80</w:t>
+            </w:r>
+          </w:p>
+        </w:tc>
+      </w:tr>
+      <w:tr>
+        <w:tc>
+          <w:tcPr/>
+          <w:p>
+            <w:pPr>
+              <w:pStyle w:val="Compact"/>
+              <w:jc w:val="left"/>
+            </w:pPr>
+            <w:r>
+              <w:t xml:space="preserve">初始本金分布</w:t>
+            </w:r>
+          </w:p>
+        </w:tc>
+        <w:tc>
+          <w:tcPr/>
+          <w:p>
+            <w:pPr>
+              <w:pStyle w:val="Compact"/>
+              <w:jc w:val="left"/>
+            </w:pPr>
+            <w:r>
+              <w:rPr>
+                <w:rStyle w:val="VerbatimChar"/>
+              </w:rPr>
+              <w:t xml:space="preserve">equal, uniform, normal, lognormal, pareto</w:t>
+            </w:r>
+          </w:p>
+        </w:tc>
+      </w:tr>
+      <w:tr>
+        <w:tc>
+          <w:tcPr/>
+          <w:p>
+            <w:pPr>
+              <w:pStyle w:val="Compact"/>
+              <w:jc w:val="left"/>
+            </w:pPr>
+            <w:r>
+              <w:t xml:space="preserve">收入分配规则</w:t>
+            </w:r>
+          </w:p>
+        </w:tc>
+        <w:tc>
+          <w:tcPr/>
+          <w:p>
+            <w:pPr>
+              <w:pStyle w:val="Compact"/>
+              <w:jc w:val="left"/>
+            </w:pPr>
+            <w:r>
+              <w:rPr>
+                <w:rStyle w:val="VerbatimChar"/>
+              </w:rPr>
+              <w:t xml:space="preserve">uniform, biased</w:t>
+            </w:r>
+          </w:p>
+        </w:tc>
+      </w:tr>
+      <w:tr>
+        <w:tc>
+          <w:tcPr/>
+          <w:p>
+            <w:pPr>
+              <w:pStyle w:val="Compact"/>
+              <w:jc w:val="left"/>
+            </w:pPr>
+            <w:r>
+              <w:t xml:space="preserve">信贷增长规则</w:t>
+            </w:r>
+          </w:p>
+        </w:tc>
+        <w:tc>
+          <w:tcPr/>
+          <w:p>
+            <w:pPr>
+              <w:pStyle w:val="Compact"/>
+              <w:jc w:val="left"/>
+            </w:pPr>
+            <w:r>
+              <w:rPr>
+                <w:rStyle w:val="VerbatimChar"/>
+              </w:rPr>
+              <w:t xml:space="preserve">random, preferential_debt</w:t>
+            </w:r>
+          </w:p>
+        </w:tc>
+      </w:tr>
+      <w:tr>
+        <w:tc>
+          <w:tcPr/>
+          <w:p>
+            <w:pPr>
+              <w:pStyle w:val="Compact"/>
+              <w:jc w:val="left"/>
+            </w:pPr>
+            <w:r>
+              <w:t xml:space="preserve">支出机制</w:t>
+            </w:r>
+            <w:r>
+              <w:t xml:space="preserve"> </w:t>
+            </w:r>
+            <w:r>
+              <w:rPr>
+                <w:rStyle w:val="VerbatimChar"/>
+              </w:rPr>
+              <w:t xml:space="preserve">(a,b)</w:t>
+            </w:r>
+          </w:p>
+        </w:tc>
+        <w:tc>
+          <w:tcPr/>
+          <w:p>
+            <w:pPr>
+              <w:pStyle w:val="Compact"/>
+              <w:jc w:val="left"/>
+            </w:pPr>
+            <w:r>
+              <w:rPr>
+                <w:rStyle w:val="VerbatimChar"/>
+              </w:rPr>
+              <w:t xml:space="preserve">low=(0.01,0.10)</w:t>
+            </w:r>
+            <w:r>
+              <w:t xml:space="preserve">、</w:t>
+            </w:r>
+            <w:r>
+              <w:rPr>
+                <w:rStyle w:val="VerbatimChar"/>
+              </w:rPr>
+              <w:t xml:space="preserve">baseline=(0.02,0.20)</w:t>
+            </w:r>
+            <w:r>
+              <w:t xml:space="preserve">、</w:t>
+            </w:r>
+            <w:r>
+              <w:rPr>
+                <w:rStyle w:val="VerbatimChar"/>
+              </w:rPr>
+              <w:t xml:space="preserve">high_income=(0.02,0.40)</w:t>
+            </w:r>
+            <w:r>
+              <w:t xml:space="preserve">、</w:t>
+            </w:r>
+            <w:r>
+              <w:rPr>
+                <w:rStyle w:val="VerbatimChar"/>
+              </w:rPr>
+              <w:t xml:space="preserve">high_wealth=(0.04,0.20)</w:t>
+            </w:r>
+            <w:r>
+              <w:t xml:space="preserve">、</w:t>
+            </w:r>
+            <w:r>
+              <w:rPr>
+                <w:rStyle w:val="VerbatimChar"/>
+              </w:rPr>
+              <w:t xml:space="preserve">high_both=(0.04,0.40)</w:t>
+            </w:r>
+          </w:p>
+        </w:tc>
+      </w:tr>
+      <w:tr>
+        <w:tc>
+          <w:tcPr/>
+          <w:p>
+            <w:pPr>
+              <w:pStyle w:val="Compact"/>
+              <w:jc w:val="left"/>
+            </w:pPr>
+            <w:r>
+              <w:t xml:space="preserve">交易机会拓扑</w:t>
+            </w:r>
+          </w:p>
+        </w:tc>
+        <w:tc>
+          <w:tcPr/>
+          <w:p>
+            <w:pPr>
+              <w:pStyle w:val="Compact"/>
+              <w:jc w:val="left"/>
+            </w:pPr>
+            <w:r>
+              <w:rPr>
+                <w:rStyle w:val="VerbatimChar"/>
+              </w:rPr>
+              <w:t xml:space="preserve">complete</w:t>
+            </w:r>
+            <w:r>
+              <w:t xml:space="preserve">；</w:t>
+            </w:r>
+            <w:r>
+              <w:rPr>
+                <w:rStyle w:val="VerbatimChar"/>
+              </w:rPr>
+              <w:t xml:space="preserve">er/ba/sw</w:t>
+            </w:r>
+            <w:r>
+              <w:t xml:space="preserve"> </w:t>
+            </w:r>
+            <w:r>
+              <w:t xml:space="preserve">的目标平均度</w:t>
+            </w:r>
+            <w:r>
+              <w:t xml:space="preserve"> </w:t>
+            </w:r>
+            <w:r>
+              <w:rPr>
+                <w:rStyle w:val="VerbatimChar"/>
+              </w:rPr>
+              <w:t xml:space="preserve">k=6,12,24</w:t>
+            </w:r>
+          </w:p>
+        </w:tc>
+      </w:tr>
+    </w:tbl>
+    <w:p>
+      <w:pPr>
+        <w:pStyle w:val="BodyText"/>
+      </w:pPr>
+      <w:r>
+        <w:t xml:space="preserve">除上述扫描轴外，本轮保持以下固定基线：</w:t>
+      </w:r>
+    </w:p>
+    <w:tbl>
+      <w:tblPr>
+        <w:tblStyle w:val="Table"/>
+        <w:tblW w:type="pct" w:w="5000"/>
+        <w:tblLook w:firstRow="1" w:lastRow="0" w:firstColumn="0" w:lastColumn="0" w:noHBand="0" w:noVBand="0" w:val="0020"/>
+        <w:jc w:val="start"/>
+        <w:tblLayout w:type="fixed"/>
+      </w:tblPr>
+      <w:tblGrid>
+        <w:gridCol w:w="3960"/>
+        <w:gridCol w:w="3960"/>
+      </w:tblGrid>
+      <w:tr>
+        <w:trPr>
+          <w:tblHeader w:val="true"/>
+        </w:trPr>
+        <w:tc>
+          <w:tcPr/>
+          <w:p>
+            <w:pPr>
+              <w:pStyle w:val="Compact"/>
+              <w:jc w:val="left"/>
+            </w:pPr>
+            <w:r>
+              <w:t xml:space="preserve">固定项</w:t>
+            </w:r>
+          </w:p>
+        </w:tc>
+        <w:tc>
+          <w:tcPr/>
+          <w:p>
+            <w:pPr>
+              <w:pStyle w:val="Compact"/>
+              <w:jc w:val="left"/>
+            </w:pPr>
+            <w:r>
+              <w:t xml:space="preserve">本轮取值与含义</w:t>
+            </w:r>
+          </w:p>
+        </w:tc>
+      </w:tr>
+      <w:tr>
+        <w:tc>
+          <w:tcPr/>
+          <w:p>
+            <w:pPr>
+              <w:pStyle w:val="Compact"/>
+              <w:jc w:val="left"/>
+            </w:pPr>
+            <w:r>
+              <w:t xml:space="preserve">节点数</w:t>
+            </w:r>
+          </w:p>
+        </w:tc>
+        <w:tc>
+          <w:tcPr/>
+          <w:p>
+            <w:pPr>
+              <w:pStyle w:val="Compact"/>
+              <w:jc w:val="left"/>
+            </w:pPr>
+            <w:r>
+              <w:rPr>
+                <w:rStyle w:val="VerbatimChar"/>
+              </w:rPr>
+              <w:t xml:space="preserve">N=120</w:t>
+            </w:r>
+          </w:p>
+        </w:tc>
+      </w:tr>
+      <w:tr>
+        <w:tc>
+          <w:tcPr/>
+          <w:p>
+            <w:pPr>
+              <w:pStyle w:val="Compact"/>
+              <w:jc w:val="left"/>
+            </w:pPr>
+            <w:r>
+              <w:t xml:space="preserve">独立重复</w:t>
+            </w:r>
+          </w:p>
+        </w:tc>
+        <w:tc>
+          <w:tcPr/>
+          <w:p>
+            <w:pPr>
+              <w:pStyle w:val="Compact"/>
+              <w:jc w:val="left"/>
+            </w:pPr>
+            <w:r>
+              <w:t xml:space="preserve">每个 scenario</w:t>
+            </w:r>
+            <w:r>
+              <w:t xml:space="preserve"> </w:t>
+            </w:r>
+            <w:r>
+              <w:rPr>
+                <w:rStyle w:val="VerbatimChar"/>
+              </w:rPr>
+              <w:t xml:space="preserve">3</w:t>
+            </w:r>
+            <w:r>
+              <w:t xml:space="preserve"> </w:t>
+            </w:r>
+            <w:r>
+              <w:t xml:space="preserve">个 seed/run</w:t>
+            </w:r>
+          </w:p>
+        </w:tc>
+      </w:tr>
+      <w:tr>
+        <w:tc>
+          <w:tcPr/>
+          <w:p>
+            <w:pPr>
+              <w:pStyle w:val="Compact"/>
+              <w:jc w:val="left"/>
+            </w:pPr>
+            <w:r>
+              <w:t xml:space="preserve">单 run 长度</w:t>
+            </w:r>
+          </w:p>
+        </w:tc>
+        <w:tc>
+          <w:tcPr/>
+          <w:p>
+            <w:pPr>
+              <w:pStyle w:val="Compact"/>
+              <w:jc w:val="left"/>
+            </w:pPr>
+            <w:r>
+              <w:t xml:space="preserve">最多</w:t>
+            </w:r>
+            <w:r>
+              <w:t xml:space="preserve"> </w:t>
+            </w:r>
+            <w:r>
+              <w:rPr>
+                <w:rStyle w:val="VerbatimChar"/>
+              </w:rPr>
+              <w:t xml:space="preserve">120 periods</w:t>
+            </w:r>
+            <w:r>
+              <w:t xml:space="preserve">；</w:t>
+            </w:r>
+            <w:r>
+              <w:rPr>
+                <w:rStyle w:val="VerbatimChar"/>
+              </w:rPr>
+              <w:t xml:space="preserve">max_time_steps=0</w:t>
+            </w:r>
+            <w:r>
+              <w:t xml:space="preserve"> </w:t>
+            </w:r>
+            <w:r>
+              <w:t xml:space="preserve">表示不额外限制累计 time_step</w:t>
+            </w:r>
+          </w:p>
+        </w:tc>
+      </w:tr>
+      <w:tr>
+        <w:tc>
+          <w:tcPr/>
+          <w:p>
+            <w:pPr>
+              <w:pStyle w:val="Compact"/>
+              <w:jc w:val="left"/>
+            </w:pPr>
+            <w:r>
+              <w:t xml:space="preserve">初始本金规模</w:t>
+            </w:r>
+          </w:p>
+        </w:tc>
+        <w:tc>
+          <w:tcPr/>
+          <w:p>
+            <w:pPr>
+              <w:pStyle w:val="Compact"/>
+              <w:jc w:val="left"/>
+            </w:pPr>
+            <w:r>
+              <w:rPr>
+                <w:rStyle w:val="VerbatimChar"/>
+              </w:rPr>
+              <w:t xml:space="preserve">mean_initial_money=20.0</w:t>
+            </w:r>
+            <w:r>
+              <w:t xml:space="preserve">；具体样本由本金分布决定</w:t>
+            </w:r>
+          </w:p>
+        </w:tc>
+      </w:tr>
+      <w:tr>
+        <w:tc>
+          <w:tcPr/>
+          <w:p>
+            <w:pPr>
+              <w:pStyle w:val="Compact"/>
+              <w:jc w:val="left"/>
+            </w:pPr>
+            <w:r>
+              <w:t xml:space="preserve">初始参考收入</w:t>
+            </w:r>
+          </w:p>
+        </w:tc>
+        <w:tc>
+          <w:tcPr/>
+          <w:p>
+            <w:pPr>
+              <w:pStyle w:val="Compact"/>
+              <w:jc w:val="left"/>
+            </w:pPr>
+            <w:r>
+              <w:rPr>
+                <w:rStyle w:val="VerbatimChar"/>
+              </w:rPr>
+              <w:t xml:space="preserve">initial_income_per_capita=5.0</w:t>
+            </w:r>
+            <w:r>
+              <w:t xml:space="preserve">，所以初始</w:t>
+            </w:r>
+            <w:r>
+              <w:t xml:space="preserve"> </w:t>
+            </w:r>
+            <w:r>
+              <w:rPr>
+                <w:rStyle w:val="VerbatimChar"/>
+              </w:rPr>
+              <w:t xml:space="preserve">Y_0=120*5=600</w:t>
+            </w:r>
+          </w:p>
+        </w:tc>
+      </w:tr>
+      <w:tr>
+        <w:tc>
+          <w:tcPr/>
+          <w:p>
+            <w:pPr>
+              <w:pStyle w:val="Compact"/>
+              <w:jc w:val="left"/>
+            </w:pPr>
+            <w:r>
+              <w:t xml:space="preserve">period 长度规则</w:t>
+            </w:r>
+          </w:p>
+        </w:tc>
+        <w:tc>
+          <w:tcPr/>
+          <w:p>
+            <w:pPr>
+              <w:pStyle w:val="Compact"/>
+              <w:jc w:val="left"/>
+            </w:pPr>
+            <w:r>
+              <w:t xml:space="preserve">收入内生：</w:t>
+            </w:r>
+            <w:r>
+              <w:rPr>
+                <w:rStyle w:val="VerbatimChar"/>
+              </w:rPr>
+              <w:t xml:space="preserve">K_t=round(c*Y_(t-1))</w:t>
+            </w:r>
+            <w:r>
+              <w:t xml:space="preserve">；固定</w:t>
+            </w:r>
+            <w:r>
+              <w:t xml:space="preserve"> </w:t>
+            </w:r>
+            <w:r>
+              <w:rPr>
+                <w:rStyle w:val="VerbatimChar"/>
+              </w:rPr>
+              <w:t xml:space="preserve">K</w:t>
+            </w:r>
+            <w:r>
+              <w:t xml:space="preserve"> </w:t>
+            </w:r>
+            <w:r>
+              <w:t xml:space="preserve">参数不参与本轮计算</w:t>
+            </w:r>
+          </w:p>
+        </w:tc>
+      </w:tr>
+      <w:tr>
+        <w:tc>
+          <w:tcPr/>
+          <w:p>
+            <w:pPr>
+              <w:pStyle w:val="Compact"/>
+              <w:jc w:val="left"/>
+            </w:pPr>
+            <w:r>
+              <w:t xml:space="preserve">单位信贷规模</w:t>
+            </w:r>
+          </w:p>
+        </w:tc>
+        <w:tc>
+          <w:tcPr/>
+          <w:p>
+            <w:pPr>
+              <w:pStyle w:val="Compact"/>
+              <w:jc w:val="left"/>
+            </w:pPr>
+            <w:r>
+              <w:t xml:space="preserve">每个成功 credit</w:t>
+            </w:r>
+            <w:r>
+              <w:t xml:space="preserve"> </w:t>
+            </w:r>
+            <w:r>
+              <w:rPr>
+                <w:rStyle w:val="VerbatimChar"/>
+              </w:rPr>
+              <w:t xml:space="preserve">time_step</w:t>
+            </w:r>
+            <w:r>
+              <w:t xml:space="preserve"> </w:t>
+            </w:r>
+            <w:r>
+              <w:t xml:space="preserve">只新增</w:t>
+            </w:r>
+            <w:r>
+              <w:t xml:space="preserve"> </w:t>
+            </w:r>
+            <w:r>
+              <w:rPr>
+                <w:rStyle w:val="VerbatimChar"/>
+              </w:rPr>
+              <w:t xml:space="preserve">1</w:t>
+            </w:r>
+            <w:r>
+              <w:t xml:space="preserve"> </w:t>
+            </w:r>
+            <w:r>
+              <w:t xml:space="preserve">单位有向信贷暴露</w:t>
+            </w:r>
+          </w:p>
+        </w:tc>
+      </w:tr>
+      <w:tr>
+        <w:tc>
+          <w:tcPr/>
+          <w:p>
+            <w:pPr>
+              <w:pStyle w:val="Compact"/>
+              <w:jc w:val="left"/>
+            </w:pPr>
+            <w:r>
+              <w:t xml:space="preserve">支出顺序</w:t>
+            </w:r>
+          </w:p>
+        </w:tc>
+        <w:tc>
+          <w:tcPr/>
+          <w:p>
+            <w:pPr>
+              <w:pStyle w:val="Compact"/>
+              <w:jc w:val="left"/>
+            </w:pPr>
+            <w:r>
+              <w:t xml:space="preserve">先投资支出，再消费支出；二者都受主体现金约束</w:t>
+            </w:r>
+          </w:p>
+        </w:tc>
+      </w:tr>
+      <w:tr>
+        <w:tc>
+          <w:tcPr/>
+          <w:p>
+            <w:pPr>
+              <w:pStyle w:val="Compact"/>
+              <w:jc w:val="left"/>
+            </w:pPr>
+            <w:r>
+              <w:t xml:space="preserve">违约阈值</w:t>
+            </w:r>
+          </w:p>
+        </w:tc>
+        <w:tc>
+          <w:tcPr/>
+          <w:p>
+            <w:pPr>
+              <w:pStyle w:val="Compact"/>
+              <w:jc w:val="left"/>
+            </w:pPr>
+            <w:r>
+              <w:rPr>
+                <w:rStyle w:val="VerbatimChar"/>
+              </w:rPr>
+              <w:t xml:space="preserve">default_threshold=0.0</w:t>
+            </w:r>
+            <w:r>
+              <w:t xml:space="preserve">，严格</w:t>
+            </w:r>
+            <w:r>
+              <w:t xml:space="preserve"> </w:t>
+            </w:r>
+            <w:r>
+              <w:rPr>
+                <w:rStyle w:val="VerbatimChar"/>
+              </w:rPr>
+              <w:t xml:space="preserve">W_i&lt;0</w:t>
+            </w:r>
+            <w:r>
+              <w:t xml:space="preserve"> </w:t>
+            </w:r>
+            <w:r>
+              <w:t xml:space="preserve">才违约</w:t>
+            </w:r>
+          </w:p>
+        </w:tc>
+      </w:tr>
+      <w:tr>
+        <w:tc>
+          <w:tcPr/>
+          <w:p>
+            <w:pPr>
+              <w:pStyle w:val="Compact"/>
+              <w:jc w:val="left"/>
+            </w:pPr>
+            <w:r>
+              <w:t xml:space="preserve">大级联标签阈值</w:t>
+            </w:r>
+          </w:p>
+        </w:tc>
+        <w:tc>
+          <w:tcPr/>
+          <w:p>
+            <w:pPr>
+              <w:pStyle w:val="Compact"/>
+              <w:jc w:val="left"/>
+            </w:pPr>
+            <w:r>
+              <w:rPr>
+                <w:rStyle w:val="VerbatimChar"/>
+              </w:rPr>
+              <w:t xml:space="preserve">collapse_threshold_fraction=0.10</w:t>
+            </w:r>
+            <w:r>
+              <w:t xml:space="preserve">，在</w:t>
+            </w:r>
+            <w:r>
+              <w:t xml:space="preserve"> </w:t>
+            </w:r>
+            <w:r>
+              <w:rPr>
+                <w:rStyle w:val="VerbatimChar"/>
+              </w:rPr>
+              <w:t xml:space="preserve">N=120</w:t>
+            </w:r>
+            <w:r>
+              <w:t xml:space="preserve"> </w:t>
+            </w:r>
+            <w:r>
+              <w:t xml:space="preserve">下等价于至少</w:t>
+            </w:r>
+            <w:r>
+              <w:t xml:space="preserve"> </w:t>
+            </w:r>
+            <w:r>
+              <w:rPr>
+                <w:rStyle w:val="VerbatimChar"/>
+              </w:rPr>
+              <w:t xml:space="preserve">12</w:t>
+            </w:r>
+            <w:r>
+              <w:t xml:space="preserve"> </w:t>
+            </w:r>
+            <w:r>
+              <w:t xml:space="preserve">个节点</w:t>
+            </w:r>
+          </w:p>
+        </w:tc>
+      </w:tr>
+      <w:tr>
+        <w:tc>
+          <w:tcPr/>
+          <w:p>
+            <w:pPr>
+              <w:pStyle w:val="Compact"/>
+              <w:jc w:val="left"/>
+            </w:pPr>
+            <w:r>
+              <w:t xml:space="preserve">清算规则</w:t>
+            </w:r>
+          </w:p>
+        </w:tc>
+        <w:tc>
+          <w:tcPr/>
+          <w:p>
+            <w:pPr>
+              <w:pStyle w:val="Compact"/>
+              <w:jc w:val="left"/>
+            </w:pPr>
+            <w:r>
+              <w:rPr>
+                <w:rStyle w:val="VerbatimChar"/>
+              </w:rPr>
+              <w:t xml:space="preserve">wipe_defaulted_assets=True</w:t>
+            </w:r>
+            <w:r>
+              <w:t xml:space="preserve">；现金不额外扣除，贷款资产/债务负债表内减记</w:t>
+            </w:r>
+          </w:p>
+        </w:tc>
+      </w:tr>
+      <w:tr>
+        <w:tc>
+          <w:tcPr/>
+          <w:p>
+            <w:pPr>
+              <w:pStyle w:val="Compact"/>
+              <w:jc w:val="left"/>
+            </w:pPr>
+            <w:r>
+              <w:t xml:space="preserve">违约后节点状态</w:t>
+            </w:r>
+          </w:p>
+        </w:tc>
+        <w:tc>
+          <w:tcPr/>
+          <w:p>
+            <w:pPr>
+              <w:pStyle w:val="Compact"/>
+              <w:jc w:val="left"/>
+            </w:pPr>
+            <w:r>
+              <w:rPr>
+                <w:rStyle w:val="VerbatimChar"/>
+              </w:rPr>
+              <w:t xml:space="preserve">continue_after_avalanche</w:t>
+            </w:r>
+            <w:r>
+              <w:t xml:space="preserve">：清算后节点不永久退出，后续 period 仍可参与</w:t>
+            </w:r>
+          </w:p>
+        </w:tc>
+      </w:tr>
+      <w:tr>
+        <w:tc>
+          <w:tcPr/>
+          <w:p>
+            <w:pPr>
+              <w:pStyle w:val="Compact"/>
+              <w:jc w:val="left"/>
+            </w:pPr>
+            <w:r>
+              <w:t xml:space="preserve">违约检查粒度</w:t>
+            </w:r>
+          </w:p>
+        </w:tc>
+        <w:tc>
+          <w:tcPr/>
+          <w:p>
+            <w:pPr>
+              <w:pStyle w:val="Compact"/>
+              <w:jc w:val="left"/>
+            </w:pPr>
+            <w:r>
+              <w:rPr>
+                <w:rStyle w:val="VerbatimChar"/>
+              </w:rPr>
+              <w:t xml:space="preserve">period_end</w:t>
+            </w:r>
+            <w:r>
+              <w:t xml:space="preserve">：每个 period 的所有信贷尝试和流量结算结束后统一检查</w:t>
+            </w:r>
+          </w:p>
+        </w:tc>
+      </w:tr>
+      <w:tr>
+        <w:tc>
+          <w:tcPr/>
+          <w:p>
+            <w:pPr>
+              <w:pStyle w:val="Compact"/>
+              <w:jc w:val="left"/>
+            </w:pPr>
+            <w:r>
+              <w:t xml:space="preserve">会计校验</w:t>
+            </w:r>
+          </w:p>
+        </w:tc>
+        <w:tc>
+          <w:tcPr/>
+          <w:p>
+            <w:pPr>
+              <w:pStyle w:val="Compact"/>
+              <w:jc w:val="left"/>
+            </w:pPr>
+            <w:r>
+              <w:rPr>
+                <w:rStyle w:val="VerbatimChar"/>
+              </w:rPr>
+              <w:t xml:space="preserve">validate_accounting=True</w:t>
+            </w:r>
+          </w:p>
+        </w:tc>
+      </w:tr>
+      <w:tr>
+        <w:tc>
+          <w:tcPr/>
+          <w:p>
+            <w:pPr>
+              <w:pStyle w:val="Compact"/>
+              <w:jc w:val="left"/>
+            </w:pPr>
+            <w:r>
+              <w:t xml:space="preserve">biased 基础权重</w:t>
+            </w:r>
+          </w:p>
+        </w:tc>
+        <w:tc>
+          <w:tcPr/>
+          <w:p>
+            <w:pPr>
+              <w:pStyle w:val="Compact"/>
+              <w:jc w:val="left"/>
+            </w:pPr>
+            <w:r>
+              <w:rPr>
+                <w:rStyle w:val="VerbatimChar"/>
+              </w:rPr>
+              <w:t xml:space="preserve">income_bias_floor=1.0</w:t>
+            </w:r>
+          </w:p>
+        </w:tc>
+      </w:tr>
+      <w:tr>
+        <w:tc>
+          <w:tcPr/>
+          <w:p>
+            <w:pPr>
+              <w:pStyle w:val="Compact"/>
+              <w:jc w:val="left"/>
+            </w:pPr>
+            <w:r>
+              <w:t xml:space="preserve">SW 重连概率</w:t>
+            </w:r>
+          </w:p>
+        </w:tc>
+        <w:tc>
+          <w:tcPr/>
+          <w:p>
+            <w:pPr>
+              <w:pStyle w:val="Compact"/>
+              <w:jc w:val="left"/>
+            </w:pPr>
+            <w:r>
+              <w:rPr>
+                <w:rStyle w:val="VerbatimChar"/>
+              </w:rPr>
+              <w:t xml:space="preserve">sw_rewire_probability=0.10</w:t>
+            </w:r>
+          </w:p>
+        </w:tc>
+      </w:tr>
+      <w:tr>
+        <w:tc>
+          <w:tcPr/>
+          <w:p>
+            <w:pPr>
+              <w:pStyle w:val="Compact"/>
+              <w:jc w:val="left"/>
+            </w:pPr>
+            <w:r>
+              <w:t xml:space="preserve">随机种子基线</w:t>
+            </w:r>
+          </w:p>
+        </w:tc>
+        <w:tc>
+          <w:tcPr/>
+          <w:p>
+            <w:pPr>
+              <w:pStyle w:val="Compact"/>
+              <w:jc w:val="left"/>
+            </w:pPr>
+            <w:r>
+              <w:t xml:space="preserve">主演化</w:t>
+            </w:r>
+            <w:r>
+              <w:t xml:space="preserve"> </w:t>
+            </w:r>
+            <w:r>
+              <w:rPr>
+                <w:rStyle w:val="VerbatimChar"/>
+              </w:rPr>
+              <w:t xml:space="preserve">seed_base=2026060800</w:t>
+            </w:r>
+            <w:r>
+              <w:t xml:space="preserve">，拓扑</w:t>
+            </w:r>
+            <w:r>
+              <w:t xml:space="preserve"> </w:t>
+            </w:r>
+            <w:r>
+              <w:rPr>
+                <w:rStyle w:val="VerbatimChar"/>
+              </w:rPr>
+              <w:t xml:space="preserve">topology_seed_base=2026068800</w:t>
+            </w:r>
+          </w:p>
+        </w:tc>
+      </w:tr>
+    </w:tbl>
+    <w:p>
+      <w:pPr>
+        <w:pStyle w:val="BodyText"/>
+      </w:pPr>
+      <w:r>
+        <w:t xml:space="preserve">拓扑变量的含义需要单独说明：</w:t>
+      </w:r>
+      <w:r>
+        <w:rPr>
+          <w:rStyle w:val="VerbatimChar"/>
+        </w:rPr>
+        <w:t xml:space="preserve">er/ba/sw</w:t>
+      </w:r>
+      <w:r>
+        <w:t xml:space="preserve"> </w:t>
+      </w:r>
+      <w:r>
+        <w:t xml:space="preserve">并不是在初始化时直接放入一张已有信贷暴露网络。初始化时实际信贷暴露矩阵仍为空；拓扑先生成一张无向“交易机会图”，只规定哪些节点对可以在后续 credit</w:t>
+      </w:r>
+      <w:r>
+        <w:t xml:space="preserve"> </w:t>
+      </w:r>
+      <w:r>
+        <w:rPr>
+          <w:rStyle w:val="VerbatimChar"/>
+        </w:rPr>
+        <w:t xml:space="preserve">time_step</w:t>
+      </w:r>
+      <w:r>
+        <w:t xml:space="preserve"> </w:t>
+      </w:r>
+      <w:r>
+        <w:t xml:space="preserve">中成为贷款人与借款人。实际信贷网络在运行过程中逐步形成，方向由当次贷款人/借款人决定，边权由重复成功借贷累积。</w:t>
+      </w:r>
+      <w:r>
+        <w:rPr>
+          <w:rStyle w:val="VerbatimChar"/>
+        </w:rPr>
+        <w:t xml:space="preserve">complete</w:t>
+      </w:r>
+      <w:r>
+        <w:t xml:space="preserve"> </w:t>
+      </w:r>
+      <w:r>
+        <w:t xml:space="preserve">表示没有额外机会边界，任意两主体都可成为候选对手方。</w:t>
+      </w:r>
+    </w:p>
+    <w:bookmarkEnd w:id="20"/>
+    <w:bookmarkStart w:id="21" w:name="执行摘要"/>
+    <w:p>
+      <w:pPr>
+        <w:pStyle w:val="Heading3"/>
+        <w:ind w:left="0" w:right="0" w:firstLine="0"/>
       </w:pPr>
       <w:r>
         <w:t xml:space="preserve">执行摘要</w:t>
@@ -492,11 +1577,12 @@
         <w:t xml:space="preserve">。高风险区应解释为持续失败/过载吸引子，而非 SOC。</w:t>
       </w:r>
     </w:p>
-    <w:bookmarkEnd w:id="20"/>
-    <w:bookmarkStart w:id="21" w:name="按-c-聚合的相图骨架"/>
+    <w:bookmarkEnd w:id="21"/>
+    <w:bookmarkStart w:id="22" w:name="按-c-聚合的相图骨架"/>
     <w:p>
       <w:pPr>
         <w:pStyle w:val="Heading3"/>
+        <w:ind w:left="0" w:right="0" w:firstLine="0"/>
       </w:pPr>
       <w:r>
         <w:t xml:space="preserve">按 c 聚合的相图骨架</w:t>
@@ -1241,12 +2327,13 @@
         <w:t xml:space="preserve">。</w:t>
       </w:r>
     </w:p>
-    <w:bookmarkEnd w:id="21"/>
     <w:bookmarkEnd w:id="22"/>
-    <w:bookmarkStart w:id="50" w:name="级联失效规模相图"/>
+    <w:bookmarkEnd w:id="23"/>
+    <w:bookmarkStart w:id="51" w:name="级联失效规模相图"/>
     <w:p>
       <w:pPr>
         <w:pStyle w:val="Heading2"/>
+        <w:ind w:left="0" w:right="0" w:firstLine="0"/>
       </w:pPr>
       <w:r>
         <w:t xml:space="preserve">2. 级联失效规模相图</w:t>
@@ -1261,18 +2348,18 @@
           <wp:inline>
             <wp:extent cx="5334000" cy="2883243"/>
             <wp:effectExtent b="0" l="0" r="0" t="0"/>
-            <wp:docPr descr="cascade_phase_by_money.png" title="" id="24" name="Picture"/>
+            <wp:docPr descr="cascade_phase_by_money.png" title="" id="25" name="Picture"/>
             <a:graphic>
               <a:graphicData uri="http://schemas.openxmlformats.org/drawingml/2006/picture">
                 <pic:pic>
                   <pic:nvPicPr>
-                    <pic:cNvPr descr="../results/credit_soc_comprehensive_scan_analysis_20260608_v1/cascade_phase_by_money.png" id="25" name="Picture"/>
+                    <pic:cNvPr descr="../results/credit_soc_comprehensive_scan_analysis_20260608_v1/cascade_phase_by_money.png" id="26" name="Picture"/>
                     <pic:cNvPicPr>
                       <a:picLocks noChangeArrowheads="1" noChangeAspect="1"/>
                     </pic:cNvPicPr>
                   </pic:nvPicPr>
                   <pic:blipFill>
-                    <a:blip r:embed="rId23"/>
+                    <a:blip r:embed="rId24"/>
                     <a:stretch>
                       <a:fillRect/>
                     </a:stretch>
@@ -1316,18 +2403,18 @@
           <wp:inline>
             <wp:extent cx="5334000" cy="2883243"/>
             <wp:effectExtent b="0" l="0" r="0" t="0"/>
-            <wp:docPr descr="cascade_phase_by_income_rule.png" title="" id="27" name="Picture"/>
+            <wp:docPr descr="cascade_phase_by_income_rule.png" title="" id="28" name="Picture"/>
             <a:graphic>
               <a:graphicData uri="http://schemas.openxmlformats.org/drawingml/2006/picture">
                 <pic:pic>
                   <pic:nvPicPr>
-                    <pic:cNvPr descr="../results/credit_soc_comprehensive_scan_analysis_20260608_v1/cascade_phase_by_income_rule.png" id="28" name="Picture"/>
+                    <pic:cNvPr descr="../results/credit_soc_comprehensive_scan_analysis_20260608_v1/cascade_phase_by_income_rule.png" id="29" name="Picture"/>
                     <pic:cNvPicPr>
                       <a:picLocks noChangeArrowheads="1" noChangeAspect="1"/>
                     </pic:cNvPicPr>
                   </pic:nvPicPr>
                   <pic:blipFill>
-                    <a:blip r:embed="rId26"/>
+                    <a:blip r:embed="rId27"/>
                     <a:stretch>
                       <a:fillRect/>
                     </a:stretch>
@@ -1371,18 +2458,18 @@
           <wp:inline>
             <wp:extent cx="5334000" cy="2883243"/>
             <wp:effectExtent b="0" l="0" r="0" t="0"/>
-            <wp:docPr descr="cascade_phase_by_spending.png" title="" id="30" name="Picture"/>
+            <wp:docPr descr="cascade_phase_by_spending.png" title="" id="31" name="Picture"/>
             <a:graphic>
               <a:graphicData uri="http://schemas.openxmlformats.org/drawingml/2006/picture">
                 <pic:pic>
                   <pic:nvPicPr>
-                    <pic:cNvPr descr="../results/credit_soc_comprehensive_scan_analysis_20260608_v1/cascade_phase_by_spending.png" id="31" name="Picture"/>
+                    <pic:cNvPr descr="../results/credit_soc_comprehensive_scan_analysis_20260608_v1/cascade_phase_by_spending.png" id="32" name="Picture"/>
                     <pic:cNvPicPr>
                       <a:picLocks noChangeArrowheads="1" noChangeAspect="1"/>
                     </pic:cNvPicPr>
                   </pic:nvPicPr>
                   <pic:blipFill>
-                    <a:blip r:embed="rId29"/>
+                    <a:blip r:embed="rId30"/>
                     <a:stretch>
                       <a:fillRect/>
                     </a:stretch>
@@ -1426,18 +2513,18 @@
           <wp:inline>
             <wp:extent cx="5334000" cy="3387810"/>
             <wp:effectExtent b="0" l="0" r="0" t="0"/>
-            <wp:docPr descr="cascade_phase_by_topology.png" title="" id="33" name="Picture"/>
+            <wp:docPr descr="cascade_phase_by_topology.png" title="" id="34" name="Picture"/>
             <a:graphic>
               <a:graphicData uri="http://schemas.openxmlformats.org/drawingml/2006/picture">
                 <pic:pic>
                   <pic:nvPicPr>
-                    <pic:cNvPr descr="../results/credit_soc_comprehensive_scan_analysis_20260608_v1/cascade_phase_by_topology.png" id="34" name="Picture"/>
+                    <pic:cNvPr descr="../results/credit_soc_comprehensive_scan_analysis_20260608_v1/cascade_phase_by_topology.png" id="35" name="Picture"/>
                     <pic:cNvPicPr>
                       <a:picLocks noChangeArrowheads="1" noChangeAspect="1"/>
                     </pic:cNvPicPr>
                   </pic:nvPicPr>
                   <pic:blipFill>
-                    <a:blip r:embed="rId32"/>
+                    <a:blip r:embed="rId33"/>
                     <a:stretch>
                       <a:fillRect/>
                     </a:stretch>
@@ -1481,18 +2568,18 @@
           <wp:inline>
             <wp:extent cx="5334000" cy="2883243"/>
             <wp:effectExtent b="0" l="0" r="0" t="0"/>
-            <wp:docPr descr="cascade_phase_by_growth_rule.png" title="" id="36" name="Picture"/>
+            <wp:docPr descr="cascade_phase_by_growth_rule.png" title="" id="37" name="Picture"/>
             <a:graphic>
               <a:graphicData uri="http://schemas.openxmlformats.org/drawingml/2006/picture">
                 <pic:pic>
                   <pic:nvPicPr>
-                    <pic:cNvPr descr="../results/credit_soc_comprehensive_scan_analysis_20260608_v1/cascade_phase_by_growth_rule.png" id="37" name="Picture"/>
+                    <pic:cNvPr descr="../results/credit_soc_comprehensive_scan_analysis_20260608_v1/cascade_phase_by_growth_rule.png" id="38" name="Picture"/>
                     <pic:cNvPicPr>
                       <a:picLocks noChangeArrowheads="1" noChangeAspect="1"/>
                     </pic:cNvPicPr>
                   </pic:nvPicPr>
                   <pic:blipFill>
-                    <a:blip r:embed="rId35"/>
+                    <a:blip r:embed="rId36"/>
                     <a:stretch>
                       <a:fillRect/>
                     </a:stretch>
@@ -1536,18 +2623,18 @@
           <wp:inline>
             <wp:extent cx="5334000" cy="2883243"/>
             <wp:effectExtent b="0" l="0" r="0" t="0"/>
-            <wp:docPr descr="large_event_phase_by_money.png" title="" id="39" name="Picture"/>
+            <wp:docPr descr="large_event_phase_by_money.png" title="" id="40" name="Picture"/>
             <a:graphic>
               <a:graphicData uri="http://schemas.openxmlformats.org/drawingml/2006/picture">
                 <pic:pic>
                   <pic:nvPicPr>
-                    <pic:cNvPr descr="../results/credit_soc_comprehensive_scan_analysis_20260608_v1/large_event_phase_by_money.png" id="40" name="Picture"/>
+                    <pic:cNvPr descr="../results/credit_soc_comprehensive_scan_analysis_20260608_v1/large_event_phase_by_money.png" id="41" name="Picture"/>
                     <pic:cNvPicPr>
                       <a:picLocks noChangeArrowheads="1" noChangeAspect="1"/>
                     </pic:cNvPicPr>
                   </pic:nvPicPr>
                   <pic:blipFill>
-                    <a:blip r:embed="rId38"/>
+                    <a:blip r:embed="rId39"/>
                     <a:stretch>
                       <a:fillRect/>
                     </a:stretch>
@@ -1591,18 +2678,18 @@
           <wp:inline>
             <wp:extent cx="5334000" cy="2883243"/>
             <wp:effectExtent b="0" l="0" r="0" t="0"/>
-            <wp:docPr descr="large_event_phase_by_spending.png" title="" id="42" name="Picture"/>
+            <wp:docPr descr="large_event_phase_by_spending.png" title="" id="43" name="Picture"/>
             <a:graphic>
               <a:graphicData uri="http://schemas.openxmlformats.org/drawingml/2006/picture">
                 <pic:pic>
                   <pic:nvPicPr>
-                    <pic:cNvPr descr="../results/credit_soc_comprehensive_scan_analysis_20260608_v1/large_event_phase_by_spending.png" id="43" name="Picture"/>
+                    <pic:cNvPr descr="../results/credit_soc_comprehensive_scan_analysis_20260608_v1/large_event_phase_by_spending.png" id="44" name="Picture"/>
                     <pic:cNvPicPr>
                       <a:picLocks noChangeArrowheads="1" noChangeAspect="1"/>
                     </pic:cNvPicPr>
                   </pic:nvPicPr>
                   <pic:blipFill>
-                    <a:blip r:embed="rId41"/>
+                    <a:blip r:embed="rId42"/>
                     <a:stretch>
                       <a:fillRect/>
                     </a:stretch>
@@ -1646,18 +2733,18 @@
           <wp:inline>
             <wp:extent cx="5334000" cy="3387810"/>
             <wp:effectExtent b="0" l="0" r="0" t="0"/>
-            <wp:docPr descr="large_event_phase_by_topology.png" title="" id="45" name="Picture"/>
+            <wp:docPr descr="large_event_phase_by_topology.png" title="" id="46" name="Picture"/>
             <a:graphic>
               <a:graphicData uri="http://schemas.openxmlformats.org/drawingml/2006/picture">
                 <pic:pic>
                   <pic:nvPicPr>
-                    <pic:cNvPr descr="../results/credit_soc_comprehensive_scan_analysis_20260608_v1/large_event_phase_by_topology.png" id="46" name="Picture"/>
+                    <pic:cNvPr descr="../results/credit_soc_comprehensive_scan_analysis_20260608_v1/large_event_phase_by_topology.png" id="47" name="Picture"/>
                     <pic:cNvPicPr>
                       <a:picLocks noChangeArrowheads="1" noChangeAspect="1"/>
                     </pic:cNvPicPr>
                   </pic:nvPicPr>
                   <pic:blipFill>
-                    <a:blip r:embed="rId44"/>
+                    <a:blip r:embed="rId45"/>
                     <a:stretch>
                       <a:fillRect/>
                     </a:stretch>
@@ -1701,18 +2788,18 @@
           <wp:inline>
             <wp:extent cx="5334000" cy="10307594"/>
             <wp:effectExtent b="0" l="0" r="0" t="0"/>
-            <wp:docPr descr="global_cascade_phase_map.png" title="" id="48" name="Picture"/>
+            <wp:docPr descr="global_cascade_phase_map.png" title="" id="49" name="Picture"/>
             <a:graphic>
               <a:graphicData uri="http://schemas.openxmlformats.org/drawingml/2006/picture">
                 <pic:pic>
                   <pic:nvPicPr>
-                    <pic:cNvPr descr="../results/credit_soc_comprehensive_scan_analysis_20260608_v1/global_cascade_phase_map.png" id="49" name="Picture"/>
+                    <pic:cNvPr descr="../results/credit_soc_comprehensive_scan_analysis_20260608_v1/global_cascade_phase_map.png" id="50" name="Picture"/>
                     <pic:cNvPicPr>
                       <a:picLocks noChangeArrowheads="1" noChangeAspect="1"/>
                     </pic:cNvPicPr>
                   </pic:nvPicPr>
                   <pic:blipFill>
-                    <a:blip r:embed="rId47"/>
+                    <a:blip r:embed="rId48"/>
                     <a:stretch>
                       <a:fillRect/>
                     </a:stretch>
@@ -4341,11 +5428,12 @@
         </w:tc>
       </w:tr>
     </w:tbl>
-    <w:bookmarkEnd w:id="50"/>
-    <w:bookmarkStart w:id="56" w:name="soc-快速筛选相图"/>
+    <w:bookmarkEnd w:id="51"/>
+    <w:bookmarkStart w:id="57" w:name="soc-快速筛选相图"/>
     <w:p>
       <w:pPr>
         <w:pStyle w:val="Heading2"/>
+        <w:ind w:left="0" w:right="0" w:firstLine="0"/>
       </w:pPr>
       <w:r>
         <w:t xml:space="preserve">3. SOC 快速筛选相图</w:t>
@@ -4719,10 +5807,11 @@
         <w:t xml:space="preserve">这里的“尾部幂律诊断可接受”只是快速 bootstrap 下的候选门槛；它不是最终严格幂律证明。关键在于：即使部分场景的幂律拟合不被拒绝，几乎全部场景仍被替代分布、饱和占用或非传播主导问题排除。</w:t>
       </w:r>
     </w:p>
-    <w:bookmarkStart w:id="51" w:name="soc-相图读法"/>
+    <w:bookmarkStart w:id="52" w:name="soc-相图读法"/>
     <w:p>
       <w:pPr>
         <w:pStyle w:val="Heading3"/>
+        <w:ind w:left="0" w:right="0" w:firstLine="0"/>
       </w:pPr>
       <w:r>
         <w:t xml:space="preserve">SOC 相图读法</w:t>
@@ -4846,11 +5935,12 @@
         <w:t xml:space="preserve">因此，本轮 SOC 相图的结论是“没有候选临界带”，而不是“最高风险区就是 SOC 区”。</w:t>
       </w:r>
     </w:p>
-    <w:bookmarkEnd w:id="51"/>
-    <w:bookmarkStart w:id="55" w:name="主要场景维度效应"/>
+    <w:bookmarkEnd w:id="52"/>
+    <w:bookmarkStart w:id="56" w:name="主要场景维度效应"/>
     <w:p>
       <w:pPr>
         <w:pStyle w:val="Heading3"/>
+        <w:ind w:left="0" w:right="0" w:firstLine="0"/>
       </w:pPr>
       <w:r>
         <w:t xml:space="preserve">主要场景维度效应</w:t>
@@ -5921,18 +7011,18 @@
           <wp:inline>
             <wp:extent cx="5334000" cy="10307594"/>
             <wp:effectExtent b="0" l="0" r="0" t="0"/>
-            <wp:docPr descr="global_soc_screen_phase_map.png" title="" id="53" name="Picture"/>
+            <wp:docPr descr="global_soc_screen_phase_map.png" title="" id="54" name="Picture"/>
             <a:graphic>
               <a:graphicData uri="http://schemas.openxmlformats.org/drawingml/2006/picture">
                 <pic:pic>
                   <pic:nvPicPr>
-                    <pic:cNvPr descr="../results/credit_soc_comprehensive_scan_analysis_20260608_v1/global_soc_screen_phase_map.png" id="54" name="Picture"/>
+                    <pic:cNvPr descr="../results/credit_soc_comprehensive_scan_analysis_20260608_v1/global_soc_screen_phase_map.png" id="55" name="Picture"/>
                     <pic:cNvPicPr>
                       <a:picLocks noChangeArrowheads="1" noChangeAspect="1"/>
                     </pic:cNvPicPr>
                   </pic:nvPicPr>
                   <pic:blipFill>
-                    <a:blip r:embed="rId52"/>
+                    <a:blip r:embed="rId53"/>
                     <a:stretch>
                       <a:fillRect/>
                     </a:stretch>
@@ -10327,12 +11417,13 @@
         </w:tc>
       </w:tr>
     </w:tbl>
-    <w:bookmarkEnd w:id="55"/>
     <w:bookmarkEnd w:id="56"/>
-    <w:bookmarkStart w:id="78" w:name="级联失效规模-频率关系图"/>
+    <w:bookmarkEnd w:id="57"/>
+    <w:bookmarkStart w:id="79" w:name="级联失效规模-频率关系图"/>
     <w:p>
       <w:pPr>
         <w:pStyle w:val="Heading2"/>
+        <w:ind w:left="0" w:right="0" w:firstLine="0"/>
       </w:pPr>
       <w:r>
         <w:t xml:space="preserve">4. 级联失效规模-频率关系图</w:t>
@@ -10347,18 +11438,18 @@
           <wp:inline>
             <wp:extent cx="5334000" cy="3704166"/>
             <wp:effectExtent b="0" l="0" r="0" t="0"/>
-            <wp:docPr descr="ccdf_by_c.png" title="" id="58" name="Picture"/>
+            <wp:docPr descr="ccdf_by_c.png" title="" id="59" name="Picture"/>
             <a:graphic>
               <a:graphicData uri="http://schemas.openxmlformats.org/drawingml/2006/picture">
                 <pic:pic>
                   <pic:nvPicPr>
-                    <pic:cNvPr descr="../results/credit_soc_comprehensive_scan_analysis_20260608_v1/ccdf_by_c.png" id="59" name="Picture"/>
+                    <pic:cNvPr descr="../results/credit_soc_comprehensive_scan_analysis_20260608_v1/ccdf_by_c.png" id="60" name="Picture"/>
                     <pic:cNvPicPr>
                       <a:picLocks noChangeArrowheads="1" noChangeAspect="1"/>
                     </pic:cNvPicPr>
                   </pic:nvPicPr>
                   <pic:blipFill>
-                    <a:blip r:embed="rId57"/>
+                    <a:blip r:embed="rId58"/>
                     <a:stretch>
                       <a:fillRect/>
                     </a:stretch>
@@ -10402,18 +11493,18 @@
           <wp:inline>
             <wp:extent cx="5334000" cy="3704166"/>
             <wp:effectExtent b="0" l="0" r="0" t="0"/>
-            <wp:docPr descr="ccdf_by_money.png" title="" id="61" name="Picture"/>
+            <wp:docPr descr="ccdf_by_money.png" title="" id="62" name="Picture"/>
             <a:graphic>
               <a:graphicData uri="http://schemas.openxmlformats.org/drawingml/2006/picture">
                 <pic:pic>
                   <pic:nvPicPr>
-                    <pic:cNvPr descr="../results/credit_soc_comprehensive_scan_analysis_20260608_v1/ccdf_by_money.png" id="62" name="Picture"/>
+                    <pic:cNvPr descr="../results/credit_soc_comprehensive_scan_analysis_20260608_v1/ccdf_by_money.png" id="63" name="Picture"/>
                     <pic:cNvPicPr>
                       <a:picLocks noChangeArrowheads="1" noChangeAspect="1"/>
                     </pic:cNvPicPr>
                   </pic:nvPicPr>
                   <pic:blipFill>
-                    <a:blip r:embed="rId60"/>
+                    <a:blip r:embed="rId61"/>
                     <a:stretch>
                       <a:fillRect/>
                     </a:stretch>
@@ -10457,18 +11548,18 @@
           <wp:inline>
             <wp:extent cx="5334000" cy="3704166"/>
             <wp:effectExtent b="0" l="0" r="0" t="0"/>
-            <wp:docPr descr="ccdf_by_income_rule.png" title="" id="64" name="Picture"/>
+            <wp:docPr descr="ccdf_by_income_rule.png" title="" id="65" name="Picture"/>
             <a:graphic>
               <a:graphicData uri="http://schemas.openxmlformats.org/drawingml/2006/picture">
                 <pic:pic>
                   <pic:nvPicPr>
-                    <pic:cNvPr descr="../results/credit_soc_comprehensive_scan_analysis_20260608_v1/ccdf_by_income_rule.png" id="65" name="Picture"/>
+                    <pic:cNvPr descr="../results/credit_soc_comprehensive_scan_analysis_20260608_v1/ccdf_by_income_rule.png" id="66" name="Picture"/>
                     <pic:cNvPicPr>
                       <a:picLocks noChangeArrowheads="1" noChangeAspect="1"/>
                     </pic:cNvPicPr>
                   </pic:nvPicPr>
                   <pic:blipFill>
-                    <a:blip r:embed="rId63"/>
+                    <a:blip r:embed="rId64"/>
                     <a:stretch>
                       <a:fillRect/>
                     </a:stretch>
@@ -10512,18 +11603,18 @@
           <wp:inline>
             <wp:extent cx="5334000" cy="3704166"/>
             <wp:effectExtent b="0" l="0" r="0" t="0"/>
-            <wp:docPr descr="ccdf_by_spending.png" title="" id="67" name="Picture"/>
+            <wp:docPr descr="ccdf_by_spending.png" title="" id="68" name="Picture"/>
             <a:graphic>
               <a:graphicData uri="http://schemas.openxmlformats.org/drawingml/2006/picture">
                 <pic:pic>
                   <pic:nvPicPr>
-                    <pic:cNvPr descr="../results/credit_soc_comprehensive_scan_analysis_20260608_v1/ccdf_by_spending.png" id="68" name="Picture"/>
+                    <pic:cNvPr descr="../results/credit_soc_comprehensive_scan_analysis_20260608_v1/ccdf_by_spending.png" id="69" name="Picture"/>
                     <pic:cNvPicPr>
                       <a:picLocks noChangeArrowheads="1" noChangeAspect="1"/>
                     </pic:cNvPicPr>
                   </pic:nvPicPr>
                   <pic:blipFill>
-                    <a:blip r:embed="rId66"/>
+                    <a:blip r:embed="rId67"/>
                     <a:stretch>
                       <a:fillRect/>
                     </a:stretch>
@@ -10567,18 +11658,18 @@
           <wp:inline>
             <wp:extent cx="5334000" cy="3704166"/>
             <wp:effectExtent b="0" l="0" r="0" t="0"/>
-            <wp:docPr descr="ccdf_by_topology.png" title="" id="70" name="Picture"/>
+            <wp:docPr descr="ccdf_by_topology.png" title="" id="71" name="Picture"/>
             <a:graphic>
               <a:graphicData uri="http://schemas.openxmlformats.org/drawingml/2006/picture">
                 <pic:pic>
                   <pic:nvPicPr>
-                    <pic:cNvPr descr="../results/credit_soc_comprehensive_scan_analysis_20260608_v1/ccdf_by_topology.png" id="71" name="Picture"/>
+                    <pic:cNvPr descr="../results/credit_soc_comprehensive_scan_analysis_20260608_v1/ccdf_by_topology.png" id="72" name="Picture"/>
                     <pic:cNvPicPr>
                       <a:picLocks noChangeArrowheads="1" noChangeAspect="1"/>
                     </pic:cNvPicPr>
                   </pic:nvPicPr>
                   <pic:blipFill>
-                    <a:blip r:embed="rId69"/>
+                    <a:blip r:embed="rId70"/>
                     <a:stretch>
                       <a:fillRect/>
                     </a:stretch>
@@ -10622,18 +11713,18 @@
           <wp:inline>
             <wp:extent cx="5334000" cy="3704166"/>
             <wp:effectExtent b="0" l="0" r="0" t="0"/>
-            <wp:docPr descr="ccdf_by_growth_rule.png" title="" id="73" name="Picture"/>
+            <wp:docPr descr="ccdf_by_growth_rule.png" title="" id="74" name="Picture"/>
             <a:graphic>
               <a:graphicData uri="http://schemas.openxmlformats.org/drawingml/2006/picture">
                 <pic:pic>
                   <pic:nvPicPr>
-                    <pic:cNvPr descr="../results/credit_soc_comprehensive_scan_analysis_20260608_v1/ccdf_by_growth_rule.png" id="74" name="Picture"/>
+                    <pic:cNvPr descr="../results/credit_soc_comprehensive_scan_analysis_20260608_v1/ccdf_by_growth_rule.png" id="75" name="Picture"/>
                     <pic:cNvPicPr>
                       <a:picLocks noChangeArrowheads="1" noChangeAspect="1"/>
                     </pic:cNvPicPr>
                   </pic:nvPicPr>
                   <pic:blipFill>
-                    <a:blip r:embed="rId72"/>
+                    <a:blip r:embed="rId73"/>
                     <a:stretch>
                       <a:fillRect/>
                     </a:stretch>
@@ -10677,18 +11768,18 @@
           <wp:inline>
             <wp:extent cx="5334000" cy="5418666"/>
             <wp:effectExtent b="0" l="0" r="0" t="0"/>
-            <wp:docPr descr="top_candidate_ccdf_grid.png" title="" id="76" name="Picture"/>
+            <wp:docPr descr="top_candidate_ccdf_grid.png" title="" id="77" name="Picture"/>
             <a:graphic>
               <a:graphicData uri="http://schemas.openxmlformats.org/drawingml/2006/picture">
                 <pic:pic>
                   <pic:nvPicPr>
-                    <pic:cNvPr descr="../results/credit_soc_comprehensive_scan_analysis_20260608_v1/top_candidate_ccdf_grid.png" id="77" name="Picture"/>
+                    <pic:cNvPr descr="../results/credit_soc_comprehensive_scan_analysis_20260608_v1/top_candidate_ccdf_grid.png" id="78" name="Picture"/>
                     <pic:cNvPicPr>
                       <a:picLocks noChangeArrowheads="1" noChangeAspect="1"/>
                     </pic:cNvPicPr>
                   </pic:nvPicPr>
                   <pic:blipFill>
-                    <a:blip r:embed="rId75"/>
+                    <a:blip r:embed="rId76"/>
                     <a:stretch>
                       <a:fillRect/>
                     </a:stretch>
@@ -10723,11 +11814,12 @@
         <w:t xml:space="preserve">top_candidate_ccdf_grid.png</w:t>
       </w:r>
     </w:p>
-    <w:bookmarkEnd w:id="78"/>
-    <w:bookmarkStart w:id="79" w:name="尾部拟合摘要"/>
+    <w:bookmarkEnd w:id="79"/>
+    <w:bookmarkStart w:id="80" w:name="尾部拟合摘要"/>
     <w:p>
       <w:pPr>
         <w:pStyle w:val="Heading2"/>
+        <w:ind w:left="0" w:right="0" w:firstLine="0"/>
       </w:pPr>
       <w:r>
         <w:t xml:space="preserve">5. 尾部拟合摘要</w:t>
@@ -15494,11 +16586,12 @@
         </w:tc>
       </w:tr>
     </w:tbl>
-    <w:bookmarkEnd w:id="79"/>
-    <w:bookmarkStart w:id="80" w:name="当前判定"/>
+    <w:bookmarkEnd w:id="80"/>
+    <w:bookmarkStart w:id="81" w:name="当前判定"/>
     <w:p>
       <w:pPr>
         <w:pStyle w:val="Heading2"/>
+        <w:ind w:left="0" w:right="0" w:firstLine="0"/>
       </w:pPr>
       <w:r>
         <w:t xml:space="preserve">6. 当前判定</w:t>
@@ -15571,11 +16664,12 @@
         <w:t xml:space="preserve">扩展、长时平稳性、重复违约与机制消融。</w:t>
       </w:r>
     </w:p>
-    <w:bookmarkEnd w:id="80"/>
-    <w:bookmarkStart w:id="81" w:name="解释边界和后续建议"/>
+    <w:bookmarkEnd w:id="81"/>
+    <w:bookmarkStart w:id="82" w:name="解释边界和后续建议"/>
     <w:p>
       <w:pPr>
         <w:pStyle w:val="Heading2"/>
+        <w:ind w:left="0" w:right="0" w:firstLine="0"/>
       </w:pPr>
       <w:r>
         <w:t xml:space="preserve">7. 解释边界和后续建议</w:t>
@@ -15728,8 +16822,8 @@
         <w:t xml:space="preserve">过载区继续解释为 SOC 候选；更有价值的是研究它作为“信贷流量压力导致的系统性持续失败区”的政策含义。</w:t>
       </w:r>
     </w:p>
-    <w:bookmarkEnd w:id="81"/>
     <w:bookmarkEnd w:id="82"/>
+    <w:bookmarkEnd w:id="83"/>
     <w:sectPr/>
   </w:body>
 </w:document>
@@ -16156,6 +17250,7 @@
       <w:keepNext/>
       <w:keepLines/>
       <w:spacing w:after="240" w:before="480"/>
+      <w:ind w:left="0" w:right="0" w:firstLine="0"/>
       <w:jc w:val="center"/>
     </w:pPr>
     <w:rPr>

</xml_diff>